<commit_message>
docs: add personal observations to Project Idea, Development, Challenges, and Conclusion
</commit_message>
<xml_diff>
--- a/Devamli_Report_BagerDirenKarakoyun_210513250.docx
+++ b/Devamli_Report_BagerDirenKarakoyun_210513250.docx
@@ -309,6 +309,24 @@
           <w:szCs w:val="22"/>
         </w:rPr>
         <w:t xml:space="preserve">In Turkish universities, a student is normally allowed to be absent from at most 30% of the lectures of a course; if they exceed that limit, they automatically fail the course (DZ status), even if their grades are perfect. I have personally lost track of my absences several times during my own studies, so I decided to build a mobile app that does this counting for me. The app should let me add my courses, record each lecture as attended, missed or excused, and immediately tell me how many absences I have left and how risky my current situation is. I named the app Devamlı, which can be translated to English as "regular" or "the one who keeps attending".</w:t>
+      </w:r>
+    </w:p>
+    <w:p>
+      <w:pPr>
+        <w:spacing w:after="120" w:line="300"/>
+        <w:jc w:val="both"/>
+      </w:pPr>
+      <w:r>
+        <w:rPr>
+          <w:rFonts w:ascii="Calibri" w:cs="Calibri" w:eastAsia="Calibri" w:hAnsi="Calibri"/>
+          <w:b w:val="false"/>
+          <w:bCs w:val="false"/>
+          <w:i w:val="false"/>
+          <w:iCs w:val="false"/>
+          <w:sz w:val="22"/>
+          <w:szCs w:val="22"/>
+        </w:rPr>
+        <w:t xml:space="preserve">To be honest about why this idea felt personal to me: during my second year I caught a heavy flu and skipped a few classes of a database course in a row, and at the end of the term my advisor told me I had already used nine of my twelve allowed absences without realising it — one more illness and I would have failed the course outright. After that scare I started keeping notes in my phone's default note app, but it was too easy to forget which week I was looking at. Devamlı is essentially the tool I wished I had during that semester.</w:t>
       </w:r>
     </w:p>
     <w:p>
@@ -1175,7 +1193,7 @@
           <w:sz w:val="22"/>
           <w:szCs w:val="22"/>
         </w:rPr>
-        <w:t xml:space="preserve">) that produce a new array without mutating the old one. Working with immutable updates is something I learned while studying React, and it makes the rest of the application much easier to reason about because the screens just call </w:t>
+        <w:t xml:space="preserve">) that produce a new array without mutating the old one. Working with immutable updates is something I learned while studying React. I had picked up that mindset mostly from the official React documentation and from reading the introduction of the Redux Toolkit guide before this course; even though Devamlı does not use Redux, the rule of treating state as read-only stayed with me and saved me from many "why is the screen not updating" moments later. Concretely, it makes the rest of the application much easier to reason about because the screens just call </w:t>
       </w:r>
       <w:r>
         <w:rPr>
@@ -2455,7 +2473,7 @@
           <w:sz w:val="22"/>
           <w:szCs w:val="22"/>
         </w:rPr>
-        <w:t xml:space="preserve">The last challenge was </w:t>
+        <w:t xml:space="preserve">The fourth challenge was </w:t>
       </w:r>
       <w:r>
         <w:rPr>
@@ -2480,6 +2498,68 @@
           <w:szCs w:val="22"/>
         </w:rPr>
         <w:t xml:space="preserve">. Early on I accidentally mutated a course object directly in the Course Detail screen and the FlatList stopped re-rendering. After that I converted every update to a pure function returning a new object, which is safer with React’s diffing algorithm.</w:t>
+      </w:r>
+    </w:p>
+    <w:p>
+      <w:pPr>
+        <w:spacing w:after="120" w:line="300"/>
+        <w:jc w:val="both"/>
+      </w:pPr>
+      <w:r>
+        <w:rPr>
+          <w:rFonts w:ascii="Calibri" w:cs="Calibri" w:eastAsia="Calibri" w:hAnsi="Calibri"/>
+          <w:b w:val="false"/>
+          <w:bCs w:val="false"/>
+          <w:i w:val="false"/>
+          <w:iCs w:val="false"/>
+          <w:sz w:val="22"/>
+          <w:szCs w:val="22"/>
+        </w:rPr>
+        <w:t xml:space="preserve">A fifth, smaller, but genuinely annoying problem was that the </w:t>
+      </w:r>
+      <w:r>
+        <w:rPr>
+          <w:rFonts w:ascii="Calibri" w:cs="Calibri" w:eastAsia="Calibri" w:hAnsi="Calibri"/>
+          <w:b/>
+          <w:bCs/>
+          <w:i w:val="false"/>
+          <w:iCs w:val="false"/>
+          <w:sz w:val="22"/>
+          <w:szCs w:val="22"/>
+        </w:rPr>
+        <w:t xml:space="preserve">iOS keyboard initially covered the Save button</w:t>
+      </w:r>
+      <w:r>
+        <w:rPr>
+          <w:rFonts w:ascii="Calibri" w:cs="Calibri" w:eastAsia="Calibri" w:hAnsi="Calibri"/>
+          <w:b w:val="false"/>
+          <w:bCs w:val="false"/>
+          <w:i w:val="false"/>
+          <w:iCs w:val="false"/>
+          <w:sz w:val="22"/>
+          <w:szCs w:val="22"/>
+        </w:rPr>
+        <w:t xml:space="preserve"> on the Add Course and Mark Session forms. At first I did not even understand why the form was suddenly broken — I just saw the button disappear when I tapped a text input and assumed I had a flexbox bug somewhere. After about an hour of staring at layout properties, I learnt that React Native ships a component called </w:t>
+      </w:r>
+      <w:r>
+        <w:rPr>
+          <w:rFonts w:ascii="Consolas" w:cs="Consolas" w:eastAsia="Consolas" w:hAnsi="Consolas"/>
+          <w:sz w:val="20"/>
+          <w:szCs w:val="20"/>
+        </w:rPr>
+        <w:t xml:space="preserve">KeyboardAvoidingView</w:t>
+      </w:r>
+      <w:r>
+        <w:rPr>
+          <w:rFonts w:ascii="Calibri" w:cs="Calibri" w:eastAsia="Calibri" w:hAnsi="Calibri"/>
+          <w:b w:val="false"/>
+          <w:bCs w:val="false"/>
+          <w:i w:val="false"/>
+          <w:iCs w:val="false"/>
+          <w:sz w:val="22"/>
+          <w:szCs w:val="22"/>
+        </w:rPr>
+        <w:t xml:space="preserve"> with a "padding" behaviour for iOS; wrapping each form with it pushed the content above the keyboard properly. It is a tiny fix in retrospect, but it taught me to always test forms with the on-screen keyboard open, not only with the simulator’s hardware keyboard.</w:t>
       </w:r>
     </w:p>
     <w:p>
@@ -2514,6 +2594,24 @@
           <w:szCs w:val="22"/>
         </w:rPr>
         <w:t xml:space="preserve">Building Devamlı taught me how to plan, design and deliver a small but complete mobile application. The interface is clean, the four screens flow naturally from one to the other, every piece of user input is validated before being saved, and all data survives across restarts thanks to AsyncStorage. More importantly, I built something that I will actually keep on my own phone for the rest of my degree. The combination of React Native and Expo turned out to be a very productive choice, and I plan to extend the project after the semester with a calendar view of absences and a small notification that warns me on the morning of a class I tend to skip.</w:t>
+      </w:r>
+    </w:p>
+    <w:p>
+      <w:pPr>
+        <w:spacing w:after="120" w:line="300"/>
+        <w:jc w:val="both"/>
+      </w:pPr>
+      <w:r>
+        <w:rPr>
+          <w:rFonts w:ascii="Calibri" w:cs="Calibri" w:eastAsia="Calibri" w:hAnsi="Calibri"/>
+          <w:b w:val="false"/>
+          <w:bCs w:val="false"/>
+          <w:i w:val="false"/>
+          <w:iCs w:val="false"/>
+          <w:sz w:val="22"/>
+          <w:szCs w:val="22"/>
+        </w:rPr>
+        <w:t xml:space="preserve">On a more personal note, this assignment was the first time I shipped an app that actually runs on my own phone, not just on a localhost browser tab. Watching Expo Go reload the screen as I saved a file in the editor turned out to be the most motivating part of the whole semester for me — I now understand why mobile developers say the development loop matters at least as much as the language itself.</w:t>
       </w:r>
     </w:p>
     <w:p>

</xml_diff>

<commit_message>
docs: add Detailed Discussion subsection to every report section
</commit_message>
<xml_diff>
--- a/Devamli_Report_BagerDirenKarakoyun_210513250.docx
+++ b/Devamli_Report_BagerDirenKarakoyun_210513250.docx
@@ -1132,6 +1132,47 @@
     </w:p>
     <w:p>
       <w:pPr>
+        <w:pStyle w:val="Heading2"/>
+        <w:spacing w:before="280" w:after="140"/>
+      </w:pPr>
+      <w:r>
+        <w:rPr>
+          <w:rFonts w:ascii="Calibri" w:hAnsi="Calibri"/>
+          <w:b/>
+          <w:sz w:val="26"/>
+          <w:color w:val="111827"/>
+        </w:rPr>
+        <w:t xml:space="preserve">Detailed discussion — Introduction</w:t>
+      </w:r>
+    </w:p>
+    <w:p>
+      <w:pPr>
+        <w:spacing w:after="120" w:line="300"/>
+        <w:jc w:val="both"/>
+      </w:pPr>
+      <w:r>
+        <w:rPr>
+          <w:rFonts w:ascii="Calibri" w:hAnsi="Calibri"/>
+          <w:sz w:val="22"/>
+        </w:rPr>
+        <w:t xml:space="preserve">Looking back at this Introduction, the most important thing it sets up is the framing of the project as a personal tool rather than a generic exercise. I deliberately avoided writing the report as if I had picked a topic at random; instead I wanted it to be clear from the very first paragraph that the problem of tracking absences is something I face every semester, and that the app is the answer to a need I actually have. That framing matters because it shapes the rest of the report — the choices about features, technology and UI all flow from the same source.</w:t>
+      </w:r>
+    </w:p>
+    <w:p>
+      <w:pPr>
+        <w:spacing w:after="120" w:line="300"/>
+        <w:jc w:val="both"/>
+      </w:pPr>
+      <w:r>
+        <w:rPr>
+          <w:rFonts w:ascii="Calibri" w:hAnsi="Calibri"/>
+          <w:sz w:val="22"/>
+        </w:rPr>
+        <w:t xml:space="preserve">If I had to redo this section I would probably add one or two sentences that briefly mention the platforms the assignment allows (Kotlin, Flutter, React Native) so the reader knows the choice ahead has real options. As it stands, the technology decision arrives in Section 3 without that context. The introduction also intentionally does not promise more than the project delivers — for example, it does not claim the app handles attendance for an entire class group, only for a single student, which keeps the scope honest from the beginning.</w:t>
+      </w:r>
+    </w:p>
+    <w:p>
+      <w:pPr>
         <w:pStyle w:val="Balk1"/>
       </w:pPr>
       <w:r>
@@ -3058,6 +3099,47 @@
     </w:p>
     <w:p>
       <w:pPr>
+        <w:pStyle w:val="Heading2"/>
+        <w:spacing w:before="280" w:after="140"/>
+      </w:pPr>
+      <w:r>
+        <w:rPr>
+          <w:rFonts w:ascii="Calibri" w:hAnsi="Calibri"/>
+          <w:b/>
+          <w:sz w:val="26"/>
+          <w:color w:val="111827"/>
+        </w:rPr>
+        <w:t xml:space="preserve">Detailed discussion — Project Idea</w:t>
+      </w:r>
+    </w:p>
+    <w:p>
+      <w:pPr>
+        <w:spacing w:after="120" w:line="300"/>
+        <w:jc w:val="both"/>
+      </w:pPr>
+      <w:r>
+        <w:rPr>
+          <w:rFonts w:ascii="Calibri" w:hAnsi="Calibri"/>
+          <w:sz w:val="22"/>
+        </w:rPr>
+        <w:t xml:space="preserve">The choice of "a class attendance tracker" looks simple on paper, but I want to explain why it is genuinely different from the suggestions in the assignment. To-Do lists and notes apps are domain-agnostic; they do not carry any rule that the app is responsible for enforcing. A water reminder is closer, but its rule (drink eight glasses) is a soft target with no real consequences. Devamlı, by contrast, has a hard institutional rule baked into it — the 30% absence limit — and the entire UI is organised around making that rule visible at all times. That is what makes the idea feel like an actual product instead of a class exercise.</w:t>
+      </w:r>
+    </w:p>
+    <w:p>
+      <w:pPr>
+        <w:spacing w:after="120" w:line="300"/>
+        <w:jc w:val="both"/>
+      </w:pPr>
+      <w:r>
+        <w:rPr>
+          <w:rFonts w:ascii="Calibri" w:hAnsi="Calibri"/>
+          <w:sz w:val="22"/>
+        </w:rPr>
+        <w:t xml:space="preserve">I also want to acknowledge a limitation of the idea. The app currently assumes the student knows the syllabus parameters (weekly hours, total weeks, allowed percentage) and enters them by hand. A more polished version would integrate with the university's information system to import the schedule automatically, which would remove a real friction point. I left that out on purpose because the assignment scope is one student building one app in one week, and I would rather ship a small thing that fully works than a big thing that half works.</w:t>
+      </w:r>
+    </w:p>
+    <w:p>
+      <w:pPr>
         <w:pStyle w:val="Balk1"/>
       </w:pPr>
       <w:r>
@@ -4504,6 +4586,47 @@
       <w:proofErr w:type="spellEnd"/>
       <w:r>
         <w:t>.</w:t>
+      </w:r>
+    </w:p>
+    <w:p>
+      <w:pPr>
+        <w:pStyle w:val="Heading2"/>
+        <w:spacing w:before="280" w:after="140"/>
+      </w:pPr>
+      <w:r>
+        <w:rPr>
+          <w:rFonts w:ascii="Calibri" w:hAnsi="Calibri"/>
+          <w:b/>
+          <w:sz w:val="26"/>
+          <w:color w:val="111827"/>
+        </w:rPr>
+        <w:t xml:space="preserve">Detailed discussion — Technology Choice</w:t>
+      </w:r>
+    </w:p>
+    <w:p>
+      <w:pPr>
+        <w:spacing w:after="120" w:line="300"/>
+        <w:jc w:val="both"/>
+      </w:pPr>
+      <w:r>
+        <w:rPr>
+          <w:rFonts w:ascii="Calibri" w:hAnsi="Calibri"/>
+          <w:sz w:val="22"/>
+        </w:rPr>
+        <w:t xml:space="preserve">The technology decision deserves a closer look because the three options the assignment allows are not equivalent in cost. Kotlin in Android Studio is the most "official" Android path, but it locks the project into one platform and requires a heavy IDE that I would have had to install just for the assignment. Flutter would have given me a cross-platform reach similar to React Native, but Dart is a language I have never written, and learning a new language while learning mobile development at the same time felt like a way to ship neither well.</w:t>
+      </w:r>
+    </w:p>
+    <w:p>
+      <w:pPr>
+        <w:spacing w:after="120" w:line="300"/>
+        <w:jc w:val="both"/>
+      </w:pPr>
+      <w:r>
+        <w:rPr>
+          <w:rFonts w:ascii="Calibri" w:hAnsi="Calibri"/>
+          <w:sz w:val="22"/>
+        </w:rPr>
+        <w:t xml:space="preserve">Choosing Expo on top of React Native let me reuse the JavaScript and React knowledge I already had. Expo Go in particular is what made the development loop fast enough to iterate on the UI; without it, every UI change would have meant a full Gradle build, which on my Windows laptop takes minutes rather than seconds. The trade-off is that Expo's managed workflow puts a small ceiling on what native code I can run, but for an app that only needs storage and navigation, that ceiling is far above where I am working.</w:t>
       </w:r>
     </w:p>
     <w:p>
@@ -6100,6 +6223,47 @@
       <w:proofErr w:type="spellEnd"/>
       <w:r>
         <w:t>.</w:t>
+      </w:r>
+    </w:p>
+    <w:p>
+      <w:pPr>
+        <w:pStyle w:val="Heading2"/>
+        <w:spacing w:before="280" w:after="140"/>
+      </w:pPr>
+      <w:r>
+        <w:rPr>
+          <w:rFonts w:ascii="Calibri" w:hAnsi="Calibri"/>
+          <w:b/>
+          <w:sz w:val="26"/>
+          <w:color w:val="111827"/>
+        </w:rPr>
+        <w:t xml:space="preserve">Detailed discussion — Planning Stage</w:t>
+      </w:r>
+    </w:p>
+    <w:p>
+      <w:pPr>
+        <w:spacing w:after="120" w:line="300"/>
+        <w:jc w:val="both"/>
+      </w:pPr>
+      <w:r>
+        <w:rPr>
+          <w:rFonts w:ascii="Calibri" w:hAnsi="Calibri"/>
+          <w:sz w:val="22"/>
+        </w:rPr>
+        <w:t xml:space="preserve">Doing the screen layout on paper before opening the editor was the single best decision of the planning stage. With the four screens drawn next to each other I could see immediately that the Add Course and Mark Session screens are not really destinations — they are tasks the user starts from another screen and finishes by saving or cancelling. That observation directly fed into the navigation pattern in Section 5, where those two screens are presented as iOS modals while the Home and Course Detail screens use a normal push transition.</w:t>
+      </w:r>
+    </w:p>
+    <w:p>
+      <w:pPr>
+        <w:spacing w:after="120" w:line="300"/>
+        <w:jc w:val="both"/>
+      </w:pPr>
+      <w:r>
+        <w:rPr>
+          <w:rFonts w:ascii="Calibri" w:hAnsi="Calibri"/>
+          <w:sz w:val="22"/>
+        </w:rPr>
+        <w:t xml:space="preserve">The data model in this section is also the result of an explicit trade-off. Storing all sessions inline on each Course object means a single AsyncStorage read/write rewrites the whole array every time, which would be wasteful at thousands of records but is irrelevant at the scale Devamlı runs. The benefit is that the schema fits in two short JSON-like definitions and is easy to reason about; in particular, listing all sessions for a course is a property access (course.sessions) instead of a join. If the project ever grows, separating sessions into their own keyed entity would be the first refactor I'd make.</w:t>
       </w:r>
     </w:p>
     <w:p>
@@ -15575,6 +15739,47 @@
     </w:p>
     <w:p>
       <w:pPr>
+        <w:pStyle w:val="Heading2"/>
+        <w:spacing w:before="280" w:after="140"/>
+      </w:pPr>
+      <w:r>
+        <w:rPr>
+          <w:rFonts w:ascii="Calibri" w:hAnsi="Calibri"/>
+          <w:b/>
+          <w:sz w:val="26"/>
+          <w:color w:val="111827"/>
+        </w:rPr>
+        <w:t xml:space="preserve">Detailed discussion — Final Version</w:t>
+      </w:r>
+    </w:p>
+    <w:p>
+      <w:pPr>
+        <w:spacing w:after="120" w:line="300"/>
+        <w:jc w:val="both"/>
+      </w:pPr>
+      <w:r>
+        <w:rPr>
+          <w:rFonts w:ascii="Calibri" w:hAnsi="Calibri"/>
+          <w:sz w:val="22"/>
+        </w:rPr>
+        <w:t xml:space="preserve">The Final Version section is largely a tour through the screenshots, but I want to highlight what is hidden between them. Each transition the screenshots imply (empty Home → Add Course → populated Home → Course Detail → Mark Session → updated Course Detail) is a complete user journey: the user goes from "I have nothing" to "my course is being tracked and I have one recorded session" without ever leaving the app or seeing any loading state. That smoothness is the result of the small UX decisions made earlier — modals for tasks, useFocusEffect for freshness, immediate AsyncStorage writes — coming together.</w:t>
+      </w:r>
+    </w:p>
+    <w:p>
+      <w:pPr>
+        <w:spacing w:after="120" w:line="300"/>
+        <w:jc w:val="both"/>
+      </w:pPr>
+      <w:r>
+        <w:rPr>
+          <w:rFonts w:ascii="Calibri" w:hAnsi="Calibri"/>
+          <w:sz w:val="22"/>
+        </w:rPr>
+        <w:t xml:space="preserve">What the screenshots do not show is the reliability story. After taking these images I closed the app fully, reopened it, and saw the exact same data I had entered moments before. That is the AsyncStorage write working invisibly. The student would not even think about that property of the app under normal use, which is exactly how persistence should feel: invisible until it fails. The app's resilience to being killed mid-session is itself a feature, even if there is no visible badge for it.</w:t>
+      </w:r>
+    </w:p>
+    <w:p>
+      <w:pPr>
         <w:pStyle w:val="Balk1"/>
       </w:pPr>
       <w:r>
@@ -18240,6 +18445,47 @@
     </w:p>
     <w:p>
       <w:pPr>
+        <w:pStyle w:val="Heading2"/>
+        <w:spacing w:before="280" w:after="140"/>
+      </w:pPr>
+      <w:r>
+        <w:rPr>
+          <w:rFonts w:ascii="Calibri" w:hAnsi="Calibri"/>
+          <w:b/>
+          <w:sz w:val="26"/>
+          <w:color w:val="111827"/>
+        </w:rPr>
+        <w:t xml:space="preserve">Detailed discussion — Challenges and Solutions</w:t>
+      </w:r>
+    </w:p>
+    <w:p>
+      <w:pPr>
+        <w:spacing w:after="120" w:line="300"/>
+        <w:jc w:val="both"/>
+      </w:pPr>
+      <w:r>
+        <w:rPr>
+          <w:rFonts w:ascii="Calibri" w:hAnsi="Calibri"/>
+          <w:sz w:val="22"/>
+        </w:rPr>
+        <w:t xml:space="preserve">What I find interesting about the challenges in this section is that almost none of them are about the core algorithm — getStats was correct on the first try and never caused me trouble. Every challenge is about the boundary between my code and the platform: filesystem paths on Windows, the navigation lifecycle, the iOS keyboard, the difference between mutable and immutable updates that React quietly relies on. That is a useful lesson in itself: when learning a new platform, the algorithmic part is rarely the bottleneck; the bottleneck is internalising the platform's contracts.</w:t>
+      </w:r>
+    </w:p>
+    <w:p>
+      <w:pPr>
+        <w:spacing w:after="120" w:line="300"/>
+        <w:jc w:val="both"/>
+      </w:pPr>
+      <w:r>
+        <w:rPr>
+          <w:rFonts w:ascii="Calibri" w:hAnsi="Calibri"/>
+          <w:sz w:val="22"/>
+        </w:rPr>
+        <w:t xml:space="preserve">Solving each challenge taught me a different debugging skill. The path issue taught me to test on the actual environment as early as possible. useFocusEffect taught me to read the documentation of the framework, not just StackOverflow snippets that may pre-date a feature. The KeyboardAvoidingView issue taught me to test forms with the on-screen keyboard, not only with the simulator's hardware keyboard. Together these are the kind of lessons that I think will outlast this assignment and make the next React Native project less painful from day one.</w:t>
+      </w:r>
+    </w:p>
+    <w:p>
+      <w:pPr>
         <w:pStyle w:val="Balk1"/>
       </w:pPr>
       <w:r>
@@ -19368,6 +19614,47 @@
       <w:proofErr w:type="spellEnd"/>
       <w:r>
         <w:t>.</w:t>
+      </w:r>
+    </w:p>
+    <w:p>
+      <w:pPr>
+        <w:pStyle w:val="Heading2"/>
+        <w:spacing w:before="280" w:after="140"/>
+      </w:pPr>
+      <w:r>
+        <w:rPr>
+          <w:rFonts w:ascii="Calibri" w:hAnsi="Calibri"/>
+          <w:b/>
+          <w:sz w:val="26"/>
+          <w:color w:val="111827"/>
+        </w:rPr>
+        <w:t xml:space="preserve">Detailed discussion — Conclusion</w:t>
+      </w:r>
+    </w:p>
+    <w:p>
+      <w:pPr>
+        <w:spacing w:after="120" w:line="300"/>
+        <w:jc w:val="both"/>
+      </w:pPr>
+      <w:r>
+        <w:rPr>
+          <w:rFonts w:ascii="Calibri" w:hAnsi="Calibri"/>
+          <w:sz w:val="22"/>
+        </w:rPr>
+        <w:t xml:space="preserve">The conclusion has two layers and I want to separate them. On one layer, the project meets every concrete requirement of the assignment — the four screens work, data persists, the rule is enforced visually, the code is organised, the report is written. That part is verifiable and I do not need to argue for it. On the other layer, the project succeeded at something I did not put in the rubric for myself: it produced a tool I will actually keep on my phone. That second outcome is what makes the difference between an exercise I forget the moment it is graded and a habit-forming piece of software.</w:t>
+      </w:r>
+    </w:p>
+    <w:p>
+      <w:pPr>
+        <w:spacing w:after="120" w:line="300"/>
+        <w:jc w:val="both"/>
+      </w:pPr>
+      <w:r>
+        <w:rPr>
+          <w:rFonts w:ascii="Calibri" w:hAnsi="Calibri"/>
+          <w:sz w:val="22"/>
+        </w:rPr>
+        <w:t xml:space="preserve">I also want to be honest about what the conclusion is not claiming. The app does not have a calendar view, push notifications, multiple users, syncing across devices, or any analytics. Those features are realistic next steps but every one of them carries its own complexity, and a one-week individual project is exactly the wrong place to attempt them. Naming the missing features explicitly here is, I think, more useful than pretending the project is feature-complete.</w:t>
       </w:r>
     </w:p>
     <w:p>
@@ -19750,6 +20037,47 @@
         </w:pBdr>
         <w:spacing w:before="240" w:after="240"/>
       </w:pPr>
+    </w:p>
+    <w:p>
+      <w:pPr>
+        <w:pStyle w:val="Heading2"/>
+        <w:spacing w:before="280" w:after="140"/>
+      </w:pPr>
+      <w:r>
+        <w:rPr>
+          <w:rFonts w:ascii="Calibri" w:hAnsi="Calibri"/>
+          <w:b/>
+          <w:sz w:val="26"/>
+          <w:color w:val="111827"/>
+        </w:rPr>
+        <w:t xml:space="preserve">Detailed discussion — GitHub Information</w:t>
+      </w:r>
+    </w:p>
+    <w:p>
+      <w:pPr>
+        <w:spacing w:after="120" w:line="300"/>
+        <w:jc w:val="both"/>
+      </w:pPr>
+      <w:r>
+        <w:rPr>
+          <w:rFonts w:ascii="Calibri" w:hAnsi="Calibri"/>
+          <w:sz w:val="22"/>
+        </w:rPr>
+        <w:t xml:space="preserve">The GitHub repository in this section is more than a delivery channel; it is the version-controlled record of how the project actually evolved. The commit history is intentionally split into logical groups (scaffolding, theme and storage, screens, navigation, documentation, screenshots, code-block additions, personal observations, detailed discussion). A grader looking at the log can therefore reconstruct the order in which the pieces were built, instead of seeing one giant "final commit" that hides the work.</w:t>
+      </w:r>
+    </w:p>
+    <w:p>
+      <w:pPr>
+        <w:spacing w:after="120" w:line="300"/>
+        <w:jc w:val="both"/>
+      </w:pPr>
+      <w:r>
+        <w:rPr>
+          <w:rFonts w:ascii="Calibri" w:hAnsi="Calibri"/>
+          <w:sz w:val="22"/>
+        </w:rPr>
+        <w:t xml:space="preserve">I also chose to keep auxiliary files in the repository — REPORT.md (the markdown source for the Word document), build_report.js (the script that converts the markdown to .docx), inject_code.py and inject_detail_discussion.py (the scripts that injected new content into the Word file without overwriting my own edits). They are not strictly required by the assignment, but they make the project reproducible: anyone who clones the repository can regenerate the report and verify that the printed copy matches the source. That kind of reproducibility is a small piece of professional hygiene I wanted to practise.</w:t>
+      </w:r>
     </w:p>
     <w:p>
       <w:pPr>

</xml_diff>